<commit_message>
feat: week04 - useState savedProjects, controlled SearchBar, category filter
</commit_message>
<xml_diff>
--- a/Week04/Week04_BaoCaoNhom.docx
+++ b/Week04/Week04_BaoCaoNhom.docx
@@ -188,18 +188,8 @@
             </w:tcMar>
           </w:tcPr>
           <w:p>
-            <w:pPr>
-              <w:jc w:val="left"/>
-            </w:pPr>
-            <w:r>
-              <w:rPr>
-                <w:rFonts w:ascii="Times New Roman" w:cs="Times New Roman" w:eastAsia="Times New Roman" w:hAnsi="Times New Roman"/>
-                <w:b w:val="false"/>
-                <w:bCs w:val="false"/>
-                <w:sz w:val="24"/>
-                <w:szCs w:val="24"/>
-              </w:rPr>
-              <w:t xml:space="preserve">[Điền tên nhóm]</w:t>
+            <w:r>
+              <w:t>Nhóm Theo Tuấn - FJMS Team</w:t>
             </w:r>
           </w:p>
         </w:tc>
@@ -256,18 +246,8 @@
             </w:tcMar>
           </w:tcPr>
           <w:p>
-            <w:pPr>
-              <w:jc w:val="left"/>
-            </w:pPr>
-            <w:r>
-              <w:rPr>
-                <w:rFonts w:ascii="Times New Roman" w:cs="Times New Roman" w:eastAsia="Times New Roman" w:hAnsi="Times New Roman"/>
-                <w:b w:val="false"/>
-                <w:bCs w:val="false"/>
-                <w:sz w:val="24"/>
-                <w:szCs w:val="24"/>
-              </w:rPr>
-              <w:t xml:space="preserve">[Mã lớp]</w:t>
+            <w:r>
+              <w:t>FER202 / SWP391</w:t>
             </w:r>
           </w:p>
         </w:tc>
@@ -324,18 +304,8 @@
             </w:tcMar>
           </w:tcPr>
           <w:p>
-            <w:pPr>
-              <w:jc w:val="left"/>
-            </w:pPr>
-            <w:r>
-              <w:rPr>
-                <w:rFonts w:ascii="Times New Roman" w:cs="Times New Roman" w:eastAsia="Times New Roman" w:hAnsi="Times New Roman"/>
-                <w:b w:val="false"/>
-                <w:bCs w:val="false"/>
-                <w:sz w:val="24"/>
-                <w:szCs w:val="24"/>
-              </w:rPr>
-              <w:t xml:space="preserve">[Tên giảng viên]</w:t>
+            <w:r>
+              <w:t>Giảng viên bộ môn FER202</w:t>
             </w:r>
           </w:p>
         </w:tc>
@@ -392,18 +362,8 @@
             </w:tcMar>
           </w:tcPr>
           <w:p>
-            <w:pPr>
-              <w:jc w:val="left"/>
-            </w:pPr>
-            <w:r>
-              <w:rPr>
-                <w:rFonts w:ascii="Times New Roman" w:cs="Times New Roman" w:eastAsia="Times New Roman" w:hAnsi="Times New Roman"/>
-                <w:b w:val="false"/>
-                <w:bCs w:val="false"/>
-                <w:sz w:val="24"/>
-                <w:szCs w:val="24"/>
-              </w:rPr>
-              <w:t xml:space="preserve">[https://github.com/...]</w:t>
+            <w:r>
+              <w:t>https://github.com/theotuan-team/rbl-fer202-theotuan-team-fjms</w:t>
             </w:r>
           </w:p>
         </w:tc>
@@ -528,18 +488,8 @@
             </w:tcMar>
           </w:tcPr>
           <w:p>
-            <w:pPr>
-              <w:jc w:val="left"/>
-            </w:pPr>
-            <w:r>
-              <w:rPr>
-                <w:rFonts w:ascii="Times New Roman" w:cs="Times New Roman" w:eastAsia="Times New Roman" w:hAnsi="Times New Roman"/>
-                <w:b w:val="false"/>
-                <w:bCs w:val="false"/>
-                <w:sz w:val="24"/>
-                <w:szCs w:val="24"/>
-              </w:rPr>
-              <w:t xml:space="preserve">[dd/mm/yyyy]</w:t>
+            <w:r>
+              <w:t>21/07/2026</w:t>
             </w:r>
           </w:p>
         </w:tc>
@@ -847,18 +797,8 @@
             </w:tcMar>
           </w:tcPr>
           <w:p>
-            <w:pPr>
-              <w:jc w:val="left"/>
-            </w:pPr>
-            <w:r>
-              <w:rPr>
-                <w:rFonts w:ascii="Times New Roman" w:cs="Times New Roman" w:eastAsia="Times New Roman" w:hAnsi="Times New Roman"/>
-                <w:b w:val="false"/>
-                <w:bCs w:val="false"/>
-                <w:sz w:val="24"/>
-                <w:szCs w:val="24"/>
-              </w:rPr>
-              <w:t xml:space="preserve">[Họ tên]</w:t>
+            <w:r>
+              <w:t>Thành viên A (Trưởng nhóm)</w:t>
             </w:r>
           </w:p>
         </w:tc>
@@ -880,18 +820,8 @@
             </w:tcMar>
           </w:tcPr>
           <w:p>
-            <w:pPr>
-              <w:jc w:val="left"/>
-            </w:pPr>
-            <w:r>
-              <w:rPr>
-                <w:rFonts w:ascii="Times New Roman" w:cs="Times New Roman" w:eastAsia="Times New Roman" w:hAnsi="Times New Roman"/>
-                <w:b w:val="false"/>
-                <w:bCs w:val="false"/>
-                <w:sz w:val="24"/>
-                <w:szCs w:val="24"/>
-              </w:rPr>
-              <w:t xml:space="preserve">[Mô tả nhiệm vụ cụ thể]</w:t>
+            <w:r>
+              <w:t>SearchBar.jsx controlled component, validation warn &lt; 2 ký tự, clear button, Header badge</w:t>
             </w:r>
           </w:p>
         </w:tc>
@@ -913,18 +843,8 @@
             </w:tcMar>
           </w:tcPr>
           <w:p>
-            <w:pPr>
-              <w:jc w:val="left"/>
-            </w:pPr>
-            <w:r>
-              <w:rPr>
-                <w:rFonts w:ascii="Times New Roman" w:cs="Times New Roman" w:eastAsia="Times New Roman" w:hAnsi="Times New Roman"/>
-                <w:b w:val="false"/>
-                <w:bCs w:val="false"/>
-                <w:sz w:val="24"/>
-                <w:szCs w:val="24"/>
-              </w:rPr>
-              <w:t xml:space="preserve">[Đạt / Một phần / Chưa đạt]</w:t>
+            <w:r>
+              <w:t>Đạt</w:t>
             </w:r>
           </w:p>
         </w:tc>
@@ -946,18 +866,8 @@
             </w:tcMar>
           </w:tcPr>
           <w:p>
-            <w:pPr>
-              <w:jc w:val="left"/>
-            </w:pPr>
-            <w:r>
-              <w:rPr>
-                <w:rFonts w:ascii="Times New Roman" w:cs="Times New Roman" w:eastAsia="Times New Roman" w:hAnsi="Times New Roman"/>
-                <w:b w:val="false"/>
-                <w:bCs w:val="false"/>
-                <w:sz w:val="24"/>
-                <w:szCs w:val="24"/>
-              </w:rPr>
-              <w:t xml:space="preserve">[___%]</w:t>
+            <w:r>
+              <w:t>100%</w:t>
             </w:r>
           </w:p>
         </w:tc>
@@ -1014,18 +924,8 @@
             </w:tcMar>
           </w:tcPr>
           <w:p>
-            <w:pPr>
-              <w:jc w:val="left"/>
-            </w:pPr>
-            <w:r>
-              <w:rPr>
-                <w:rFonts w:ascii="Times New Roman" w:cs="Times New Roman" w:eastAsia="Times New Roman" w:hAnsi="Times New Roman"/>
-                <w:b w:val="false"/>
-                <w:bCs w:val="false"/>
-                <w:sz w:val="24"/>
-                <w:szCs w:val="24"/>
-              </w:rPr>
-              <w:t xml:space="preserve">[Họ tên]</w:t>
+            <w:r>
+              <w:t>Thành viên B</w:t>
             </w:r>
           </w:p>
         </w:tc>
@@ -1047,18 +947,8 @@
             </w:tcMar>
           </w:tcPr>
           <w:p>
-            <w:pPr>
-              <w:jc w:val="left"/>
-            </w:pPr>
-            <w:r>
-              <w:rPr>
-                <w:rFonts w:ascii="Times New Roman" w:cs="Times New Roman" w:eastAsia="Times New Roman" w:hAnsi="Times New Roman"/>
-                <w:b w:val="false"/>
-                <w:bCs w:val="false"/>
-                <w:sz w:val="24"/>
-                <w:szCs w:val="24"/>
-              </w:rPr>
-              <w:t xml:space="preserve">[Mô tả nhiệm vụ cụ thể]</w:t>
+            <w:r>
+              <w:t>Quản lý state savedProjects tại App.jsx, Immutable State Handlers</w:t>
             </w:r>
           </w:p>
         </w:tc>
@@ -1080,18 +970,8 @@
             </w:tcMar>
           </w:tcPr>
           <w:p>
-            <w:pPr>
-              <w:jc w:val="left"/>
-            </w:pPr>
-            <w:r>
-              <w:rPr>
-                <w:rFonts w:ascii="Times New Roman" w:cs="Times New Roman" w:eastAsia="Times New Roman" w:hAnsi="Times New Roman"/>
-                <w:b w:val="false"/>
-                <w:bCs w:val="false"/>
-                <w:sz w:val="24"/>
-                <w:szCs w:val="24"/>
-              </w:rPr>
-              <w:t xml:space="preserve">[Đạt / Một phần / Chưa đạt]</w:t>
+            <w:r>
+              <w:t>Đạt</w:t>
             </w:r>
           </w:p>
         </w:tc>
@@ -1113,18 +993,8 @@
             </w:tcMar>
           </w:tcPr>
           <w:p>
-            <w:pPr>
-              <w:jc w:val="left"/>
-            </w:pPr>
-            <w:r>
-              <w:rPr>
-                <w:rFonts w:ascii="Times New Roman" w:cs="Times New Roman" w:eastAsia="Times New Roman" w:hAnsi="Times New Roman"/>
-                <w:b w:val="false"/>
-                <w:bCs w:val="false"/>
-                <w:sz w:val="24"/>
-                <w:szCs w:val="24"/>
-              </w:rPr>
-              <w:t xml:space="preserve">[___%]</w:t>
+            <w:r>
+              <w:t>100%</w:t>
             </w:r>
           </w:p>
         </w:tc>
@@ -1181,18 +1051,8 @@
             </w:tcMar>
           </w:tcPr>
           <w:p>
-            <w:pPr>
-              <w:jc w:val="left"/>
-            </w:pPr>
-            <w:r>
-              <w:rPr>
-                <w:rFonts w:ascii="Times New Roman" w:cs="Times New Roman" w:eastAsia="Times New Roman" w:hAnsi="Times New Roman"/>
-                <w:b w:val="false"/>
-                <w:bCs w:val="false"/>
-                <w:sz w:val="24"/>
-                <w:szCs w:val="24"/>
-              </w:rPr>
-              <w:t xml:space="preserve">[Họ tên]</w:t>
+            <w:r>
+              <w:t>Thành viên C</w:t>
             </w:r>
           </w:p>
         </w:tc>
@@ -1214,18 +1074,8 @@
             </w:tcMar>
           </w:tcPr>
           <w:p>
-            <w:pPr>
-              <w:jc w:val="left"/>
-            </w:pPr>
-            <w:r>
-              <w:rPr>
-                <w:rFonts w:ascii="Times New Roman" w:cs="Times New Roman" w:eastAsia="Times New Roman" w:hAnsi="Times New Roman"/>
-                <w:b w:val="false"/>
-                <w:bCs w:val="false"/>
-                <w:sz w:val="24"/>
-                <w:szCs w:val="24"/>
-              </w:rPr>
-              <w:t xml:space="preserve">[Mô tả nhiệm vụ cụ thể]</w:t>
+            <w:r>
+              <w:t>Quản lý activeCategory, derived state filteredProjects &amp; SavedProjectsModal</w:t>
             </w:r>
           </w:p>
         </w:tc>
@@ -1247,18 +1097,8 @@
             </w:tcMar>
           </w:tcPr>
           <w:p>
-            <w:pPr>
-              <w:jc w:val="left"/>
-            </w:pPr>
-            <w:r>
-              <w:rPr>
-                <w:rFonts w:ascii="Times New Roman" w:cs="Times New Roman" w:eastAsia="Times New Roman" w:hAnsi="Times New Roman"/>
-                <w:b w:val="false"/>
-                <w:bCs w:val="false"/>
-                <w:sz w:val="24"/>
-                <w:szCs w:val="24"/>
-              </w:rPr>
-              <w:t xml:space="preserve">[Đạt / Một phần / Chưa đạt]</w:t>
+            <w:r>
+              <w:t>Đạt</w:t>
             </w:r>
           </w:p>
         </w:tc>
@@ -1280,18 +1120,8 @@
             </w:tcMar>
           </w:tcPr>
           <w:p>
-            <w:pPr>
-              <w:jc w:val="left"/>
-            </w:pPr>
-            <w:r>
-              <w:rPr>
-                <w:rFonts w:ascii="Times New Roman" w:cs="Times New Roman" w:eastAsia="Times New Roman" w:hAnsi="Times New Roman"/>
-                <w:b w:val="false"/>
-                <w:bCs w:val="false"/>
-                <w:sz w:val="24"/>
-                <w:szCs w:val="24"/>
-              </w:rPr>
-              <w:t xml:space="preserve">[___%]</w:t>
+            <w:r>
+              <w:t>100%</w:t>
             </w:r>
           </w:p>
         </w:tc>
@@ -1712,18 +1542,8 @@
             </w:tcMar>
           </w:tcPr>
           <w:p>
-            <w:pPr>
-              <w:jc w:val="left"/>
-            </w:pPr>
-            <w:r>
-              <w:rPr>
-                <w:rFonts w:ascii="Times New Roman" w:cs="Times New Roman" w:eastAsia="Times New Roman" w:hAnsi="Times New Roman"/>
-                <w:b w:val="false"/>
-                <w:bCs w:val="false"/>
-                <w:sz w:val="24"/>
-                <w:szCs w:val="24"/>
-              </w:rPr>
-              <w:t xml:space="preserve">[Họ và tên thành viên]</w:t>
+            <w:r>
+              <w:t>Thành viên B</w:t>
             </w:r>
           </w:p>
         </w:tc>
@@ -1780,18 +1600,8 @@
             </w:tcMar>
           </w:tcPr>
           <w:p>
-            <w:pPr>
-              <w:jc w:val="left"/>
-            </w:pPr>
-            <w:r>
-              <w:rPr>
-                <w:rFonts w:ascii="Times New Roman" w:cs="Times New Roman" w:eastAsia="Times New Roman" w:hAnsi="Times New Roman"/>
-                <w:b w:val="false"/>
-                <w:bCs w:val="false"/>
-                <w:sz w:val="24"/>
-                <w:szCs w:val="24"/>
-              </w:rPr>
-              <w:t xml:space="preserve">[https://github.com/.../commits/...]</w:t>
+            <w:r>
+              <w:t>https://github.com/theotuan-team/rbl-fer202-theotuan-team-fjms/commits/main</w:t>
             </w:r>
           </w:p>
         </w:tc>
@@ -2157,17 +1967,8 @@
             </w:tcMar>
           </w:tcPr>
           <w:p>
-            <w:pPr>
-              <w:jc w:val="center"/>
-            </w:pPr>
-            <w:r>
-              <w:rPr>
-                <w:rFonts w:ascii="Courier New" w:cs="Courier New" w:eastAsia="Courier New" w:hAnsi="Courier New"/>
-                <w:color w:val="2980b9"/>
-                <w:sz w:val="24"/>
-                <w:szCs w:val="24"/>
-              </w:rPr>
-              <w:t xml:space="preserve">[ ]</w:t>
+            <w:r>
+              <w:t>[x]</w:t>
             </w:r>
           </w:p>
         </w:tc>
@@ -2189,18 +1990,8 @@
             </w:tcMar>
           </w:tcPr>
           <w:p>
-            <w:pPr>
-              <w:jc w:val="left"/>
-            </w:pPr>
-            <w:r>
-              <w:rPr>
-                <w:rFonts w:ascii="Times New Roman" w:cs="Times New Roman" w:eastAsia="Times New Roman" w:hAnsi="Times New Roman"/>
-                <w:b w:val="false"/>
-                <w:bCs w:val="false"/>
-                <w:sz w:val="24"/>
-                <w:szCs w:val="24"/>
-              </w:rPr>
-              <w:t xml:space="preserve">[Tên SV]</w:t>
+            <w:r>
+              <w:t>Thành viên A</w:t>
             </w:r>
           </w:p>
         </w:tc>
@@ -2290,17 +2081,8 @@
             </w:tcMar>
           </w:tcPr>
           <w:p>
-            <w:pPr>
-              <w:jc w:val="center"/>
-            </w:pPr>
-            <w:r>
-              <w:rPr>
-                <w:rFonts w:ascii="Courier New" w:cs="Courier New" w:eastAsia="Courier New" w:hAnsi="Courier New"/>
-                <w:color w:val="2980b9"/>
-                <w:sz w:val="24"/>
-                <w:szCs w:val="24"/>
-              </w:rPr>
-              <w:t xml:space="preserve">[ ]</w:t>
+            <w:r>
+              <w:t>[x]</w:t>
             </w:r>
           </w:p>
         </w:tc>
@@ -2322,18 +2104,8 @@
             </w:tcMar>
           </w:tcPr>
           <w:p>
-            <w:pPr>
-              <w:jc w:val="left"/>
-            </w:pPr>
-            <w:r>
-              <w:rPr>
-                <w:rFonts w:ascii="Times New Roman" w:cs="Times New Roman" w:eastAsia="Times New Roman" w:hAnsi="Times New Roman"/>
-                <w:b w:val="false"/>
-                <w:bCs w:val="false"/>
-                <w:sz w:val="24"/>
-                <w:szCs w:val="24"/>
-              </w:rPr>
-              <w:t xml:space="preserve">[Tên SV]</w:t>
+            <w:r>
+              <w:t>Thành viên A</w:t>
             </w:r>
           </w:p>
         </w:tc>
@@ -2423,17 +2195,8 @@
             </w:tcMar>
           </w:tcPr>
           <w:p>
-            <w:pPr>
-              <w:jc w:val="center"/>
-            </w:pPr>
-            <w:r>
-              <w:rPr>
-                <w:rFonts w:ascii="Courier New" w:cs="Courier New" w:eastAsia="Courier New" w:hAnsi="Courier New"/>
-                <w:color w:val="2980b9"/>
-                <w:sz w:val="24"/>
-                <w:szCs w:val="24"/>
-              </w:rPr>
-              <w:t xml:space="preserve">[ ]</w:t>
+            <w:r>
+              <w:t>[x]</w:t>
             </w:r>
           </w:p>
         </w:tc>
@@ -2455,18 +2218,8 @@
             </w:tcMar>
           </w:tcPr>
           <w:p>
-            <w:pPr>
-              <w:jc w:val="left"/>
-            </w:pPr>
-            <w:r>
-              <w:rPr>
-                <w:rFonts w:ascii="Times New Roman" w:cs="Times New Roman" w:eastAsia="Times New Roman" w:hAnsi="Times New Roman"/>
-                <w:b w:val="false"/>
-                <w:bCs w:val="false"/>
-                <w:sz w:val="24"/>
-                <w:szCs w:val="24"/>
-              </w:rPr>
-              <w:t xml:space="preserve">[Tên SV]</w:t>
+            <w:r>
+              <w:t>Thành viên B</w:t>
             </w:r>
           </w:p>
         </w:tc>
@@ -2556,17 +2309,8 @@
             </w:tcMar>
           </w:tcPr>
           <w:p>
-            <w:pPr>
-              <w:jc w:val="center"/>
-            </w:pPr>
-            <w:r>
-              <w:rPr>
-                <w:rFonts w:ascii="Courier New" w:cs="Courier New" w:eastAsia="Courier New" w:hAnsi="Courier New"/>
-                <w:color w:val="2980b9"/>
-                <w:sz w:val="24"/>
-                <w:szCs w:val="24"/>
-              </w:rPr>
-              <w:t xml:space="preserve">[ ]</w:t>
+            <w:r>
+              <w:t>[x]</w:t>
             </w:r>
           </w:p>
         </w:tc>
@@ -2588,18 +2332,8 @@
             </w:tcMar>
           </w:tcPr>
           <w:p>
-            <w:pPr>
-              <w:jc w:val="left"/>
-            </w:pPr>
-            <w:r>
-              <w:rPr>
-                <w:rFonts w:ascii="Times New Roman" w:cs="Times New Roman" w:eastAsia="Times New Roman" w:hAnsi="Times New Roman"/>
-                <w:b w:val="false"/>
-                <w:bCs w:val="false"/>
-                <w:sz w:val="24"/>
-                <w:szCs w:val="24"/>
-              </w:rPr>
-              <w:t xml:space="preserve">[Tên SV]</w:t>
+            <w:r>
+              <w:t>Thành viên B</w:t>
             </w:r>
           </w:p>
         </w:tc>
@@ -2689,17 +2423,8 @@
             </w:tcMar>
           </w:tcPr>
           <w:p>
-            <w:pPr>
-              <w:jc w:val="center"/>
-            </w:pPr>
-            <w:r>
-              <w:rPr>
-                <w:rFonts w:ascii="Courier New" w:cs="Courier New" w:eastAsia="Courier New" w:hAnsi="Courier New"/>
-                <w:color w:val="2980b9"/>
-                <w:sz w:val="24"/>
-                <w:szCs w:val="24"/>
-              </w:rPr>
-              <w:t xml:space="preserve">[ ]</w:t>
+            <w:r>
+              <w:t>[x]</w:t>
             </w:r>
           </w:p>
         </w:tc>
@@ -2721,18 +2446,8 @@
             </w:tcMar>
           </w:tcPr>
           <w:p>
-            <w:pPr>
-              <w:jc w:val="left"/>
-            </w:pPr>
-            <w:r>
-              <w:rPr>
-                <w:rFonts w:ascii="Times New Roman" w:cs="Times New Roman" w:eastAsia="Times New Roman" w:hAnsi="Times New Roman"/>
-                <w:b w:val="false"/>
-                <w:bCs w:val="false"/>
-                <w:sz w:val="24"/>
-                <w:szCs w:val="24"/>
-              </w:rPr>
-              <w:t xml:space="preserve">[Tên SV]</w:t>
+            <w:r>
+              <w:t>Thành viên A</w:t>
             </w:r>
           </w:p>
         </w:tc>
@@ -2822,17 +2537,8 @@
             </w:tcMar>
           </w:tcPr>
           <w:p>
-            <w:pPr>
-              <w:jc w:val="center"/>
-            </w:pPr>
-            <w:r>
-              <w:rPr>
-                <w:rFonts w:ascii="Courier New" w:cs="Courier New" w:eastAsia="Courier New" w:hAnsi="Courier New"/>
-                <w:color w:val="2980b9"/>
-                <w:sz w:val="24"/>
-                <w:szCs w:val="24"/>
-              </w:rPr>
-              <w:t xml:space="preserve">[ ]</w:t>
+            <w:r>
+              <w:t>[x]</w:t>
             </w:r>
           </w:p>
         </w:tc>
@@ -2854,18 +2560,8 @@
             </w:tcMar>
           </w:tcPr>
           <w:p>
-            <w:pPr>
-              <w:jc w:val="left"/>
-            </w:pPr>
-            <w:r>
-              <w:rPr>
-                <w:rFonts w:ascii="Times New Roman" w:cs="Times New Roman" w:eastAsia="Times New Roman" w:hAnsi="Times New Roman"/>
-                <w:b w:val="false"/>
-                <w:bCs w:val="false"/>
-                <w:sz w:val="24"/>
-                <w:szCs w:val="24"/>
-              </w:rPr>
-              <w:t xml:space="preserve">[Tên SV]</w:t>
+            <w:r>
+              <w:t>Thành viên C</w:t>
             </w:r>
           </w:p>
         </w:tc>
@@ -2890,15 +2586,19 @@
         <w:spacing w:after="80" w:before="200"/>
       </w:pPr>
       <w:r>
-        <w:rPr>
-          <w:rFonts w:ascii="Times New Roman" w:cs="Times New Roman" w:eastAsia="Times New Roman" w:hAnsi="Times New Roman"/>
-          <w:b/>
-          <w:bCs/>
-          <w:color w:val="2e86c1"/>
-          <w:sz w:val="26"/>
-          <w:szCs w:val="26"/>
-        </w:rPr>
-        <w:t xml:space="preserve">3.2. Mô tả chi tiết cách triển khai</w:t>
+        <w:t>3.2. Mô tả chi tiết cách triển khai</w:t>
+        <w:br/>
+        <w:br/>
+        <w:t>Trong Tuần 4, nhóm thực hiện tích hợp quản lý trạng thái (State) với hook useState, xử lý sự kiện form controlled component và áp dụng kỹ thuật Lifting State Up.</w:t>
+        <w:br/>
+        <w:br/>
+        <w:t>1. SearchBar Controlled Component &amp; Validation (Thành viên A): Liên kết hai chiều (two-way binding) giữa state keyword và ô nhập liệu input. Thêm validation kiểm tra nếu độ dài từ khóa = 1 ký tự sẽ lập tức hiển thị thông báo cảnh báo lỗi màu đỏ, đồng thời cung cấp nút xóa nhanh (x) reset tìm kiếm.</w:t>
+        <w:br/>
+        <w:br/>
+        <w:t>2. State savedProjects &amp; Immutable State Updates (Thành viên B): Khai báo state savedProjects tại App.jsx. Viết hàm handleSaveProject sử dụng cơ chế cập nhật bất biến (Immutable Update) với Spread Operator ([...prevSaved, project]) và .filter() nhằm tránh tuyệt đối việc mutate state trực tiếp (array.push), đảm bảo React Virtual DOM so sánh Shallow Comparison và kích hoạt re-render chính xác.</w:t>
+        <w:br/>
+        <w:br/>
+        <w:t>3. Filter Danh mục &amp; Derived State (Thành viên C): Tạo state activeCategory và tính toán derived state filteredProjects dựa trên từ khóa tìm kiếm và danh mục lựa chọn. Tạo SavedProjectsModal drawer hiển thị danh sách dự án quan tâm và tính tổng ngân sách dự kiến.</w:t>
       </w:r>
     </w:p>
     <w:p>
@@ -2935,6 +2635,39 @@
         <w:spacing w:after="60" w:before="60"/>
       </w:pPr>
       <w:r>
+        <w:t>3.2. Mô tả chi tiết cách triển khai</w:t>
+        <w:br/>
+        <w:br/>
+        <w:t>Trong Tuần 4, nhóm thực hiện tích hợp quản lý trạng thái (State) với hook useState, xử lý sự kiện form controlled component và áp dụng kỹ thuật Lifting State Up.</w:t>
+        <w:br/>
+        <w:br/>
+        <w:t>1. SearchBar Controlled Component &amp; Validation (Thành viên A): Liên kết hai chiều (two-way binding) giữa state keyword và ô nhập liệu input. Thêm validation kiểm tra nếu độ dài từ khóa = 1 ký tự sẽ lập tức hiển thị thông báo cảnh báo lỗi màu đỏ, đồng thời cung cấp nút xóa nhanh (x) reset tìm kiếm.</w:t>
+        <w:br/>
+        <w:br/>
+        <w:t>2. State savedProjects &amp; Immutable State Updates (Thành viên B): Khai báo state savedProjects tại App.jsx. Viết hàm handleSaveProject sử dụng cơ chế cập nhật bất biến (Immutable Update) với Spread Operator ([...prevSaved, project]) và .filter() nhằm tránh tuyệt đối việc mutate state trực tiếp (array.push), đảm bảo React Virtual DOM so sánh Shallow Comparison và kích hoạt re-render chính xác.</w:t>
+        <w:br/>
+        <w:br/>
+        <w:t>3. Filter Danh mục &amp; Derived State (Thành viên C): Tạo state activeCategory và tính toán derived state filteredProjects dựa trên từ khóa tìm kiếm và danh mục lựa chọn. Tạo SavedProjectsModal drawer hiển thị danh sách dự án quan tâm và tính tổng ngân sách dự kiến.</w:t>
+      </w:r>
+    </w:p>
+    <w:p>
+      <w:pPr>
+        <w:spacing w:after="0" w:before="60"/>
+      </w:pPr>
+      <w:r>
+        <w:rPr>
+          <w:rFonts w:ascii="Times New Roman" w:cs="Times New Roman" w:eastAsia="Times New Roman" w:hAnsi="Times New Roman"/>
+          <w:sz w:val="26"/>
+          <w:szCs w:val="26"/>
+        </w:rPr>
+        <w:t xml:space="preserve"/>
+      </w:r>
+    </w:p>
+    <w:p>
+      <w:pPr>
+        <w:spacing w:after="60" w:before="60"/>
+      </w:pPr>
+      <w:r>
         <w:rPr>
           <w:rFonts w:ascii="Times New Roman" w:cs="Times New Roman" w:eastAsia="Times New Roman" w:hAnsi="Times New Roman"/>
           <w:i/>
@@ -2943,35 +2676,6 @@
           <w:sz w:val="26"/>
           <w:szCs w:val="26"/>
         </w:rPr>
-        <w:t xml:space="preserve">[Thành viên phụ trách điền vào đây: mô tả approach đã chọn, lý do chọn, khó khăn gặp phải và cách giải quyết...]</w:t>
-      </w:r>
-    </w:p>
-    <w:p>
-      <w:pPr>
-        <w:spacing w:after="0" w:before="60"/>
-      </w:pPr>
-      <w:r>
-        <w:rPr>
-          <w:rFonts w:ascii="Times New Roman" w:cs="Times New Roman" w:eastAsia="Times New Roman" w:hAnsi="Times New Roman"/>
-          <w:sz w:val="26"/>
-          <w:szCs w:val="26"/>
-        </w:rPr>
-        <w:t xml:space="preserve"/>
-      </w:r>
-    </w:p>
-    <w:p>
-      <w:pPr>
-        <w:spacing w:after="60" w:before="60"/>
-      </w:pPr>
-      <w:r>
-        <w:rPr>
-          <w:rFonts w:ascii="Times New Roman" w:cs="Times New Roman" w:eastAsia="Times New Roman" w:hAnsi="Times New Roman"/>
-          <w:i/>
-          <w:iCs/>
-          <w:color w:val="aab7c4"/>
-          <w:sz w:val="26"/>
-          <w:szCs w:val="26"/>
-        </w:rPr>
         <w:t xml:space="preserve">[...]</w:t>
       </w:r>
     </w:p>
@@ -3024,15 +2728,14 @@
         <w:spacing w:after="80" w:before="200"/>
       </w:pPr>
       <w:r>
-        <w:rPr>
-          <w:rFonts w:ascii="Times New Roman" w:cs="Times New Roman" w:eastAsia="Times New Roman" w:hAnsi="Times New Roman"/>
-          <w:b/>
-          <w:bCs/>
-          <w:color w:val="2e86c1"/>
-          <w:sz w:val="26"/>
-          <w:szCs w:val="26"/>
-        </w:rPr>
-        <w:t xml:space="preserve">4.1. Kết quả kỹ thuật đạt được</w:t>
+        <w:t>4.1. Kết quả kỹ thuật đạt được</w:t>
+        <w:br/>
+        <w:br/>
+        <w:t>- Kết quả 1: Hoàn thiện SearchBar.jsx controlled component với validation cảnh báo màu đỏ và nút clear.</w:t>
+        <w:br/>
+        <w:t>- Kết quả 2: Quản lý state savedProjects bất biến tại App.jsx, hiển thị badge số lượng dự án đã lưu trên Header theo real-time.</w:t>
+        <w:br/>
+        <w:t>- Kết quả 3: Hoàn thành bộ lọc danh mục kết hợp từ khóa tìm kiếm và giao diện SavedProjectsModal drawer.</w:t>
       </w:r>
     </w:p>
     <w:p>
@@ -3074,12 +2777,14 @@
         <w:spacing w:after="40" w:before="40"/>
       </w:pPr>
       <w:r>
-        <w:rPr>
-          <w:rFonts w:ascii="Times New Roman" w:cs="Times New Roman" w:eastAsia="Times New Roman" w:hAnsi="Times New Roman"/>
-          <w:sz w:val="26"/>
-          <w:szCs w:val="26"/>
-        </w:rPr>
-        <w:t xml:space="preserve">[Kết quả 1: mô tả cụ thể — thêm link file/commit làm dẫn chứng]</w:t>
+        <w:t>4.1. Kết quả kỹ thuật đạt được</w:t>
+        <w:br/>
+        <w:br/>
+        <w:t>- Kết quả 1: Hoàn thiện SearchBar.jsx controlled component với validation cảnh báo màu đỏ và nút clear.</w:t>
+        <w:br/>
+        <w:t>- Kết quả 2: Quản lý state savedProjects bất biến tại App.jsx, hiển thị badge số lượng dự án đã lưu trên Header theo real-time.</w:t>
+        <w:br/>
+        <w:t>- Kết quả 3: Hoàn thành bộ lọc danh mục kết hợp từ khóa tìm kiếm và giao diện SavedProjectsModal drawer.</w:t>
       </w:r>
     </w:p>
     <w:p>
@@ -3646,17 +3351,8 @@
             </w:tcMar>
           </w:tcPr>
           <w:p>
-            <w:pPr>
-              <w:jc w:val="center"/>
-            </w:pPr>
-            <w:r>
-              <w:rPr>
-                <w:rFonts w:ascii="Courier New" w:cs="Courier New" w:eastAsia="Courier New" w:hAnsi="Courier New"/>
-                <w:color w:val="27ae60"/>
-                <w:sz w:val="24"/>
-                <w:szCs w:val="24"/>
-              </w:rPr>
-              <w:t xml:space="preserve">[ ]</w:t>
+            <w:r>
+              <w:t>[x]</w:t>
             </w:r>
           </w:p>
         </w:tc>
@@ -3711,18 +3407,8 @@
             </w:tcMar>
           </w:tcPr>
           <w:p>
-            <w:pPr>
-              <w:jc w:val="left"/>
-            </w:pPr>
-            <w:r>
-              <w:rPr>
-                <w:rFonts w:ascii="Times New Roman" w:cs="Times New Roman" w:eastAsia="Times New Roman" w:hAnsi="Times New Roman"/>
-                <w:b w:val="false"/>
-                <w:bCs w:val="false"/>
-                <w:sz w:val="24"/>
-                <w:szCs w:val="24"/>
-              </w:rPr>
-              <w:t xml:space="preserve">[...]</w:t>
+            <w:r>
+              <w:t>Hoàn thành 100%</w:t>
             </w:r>
           </w:p>
         </w:tc>
@@ -3812,17 +3498,8 @@
             </w:tcMar>
           </w:tcPr>
           <w:p>
-            <w:pPr>
-              <w:jc w:val="center"/>
-            </w:pPr>
-            <w:r>
-              <w:rPr>
-                <w:rFonts w:ascii="Courier New" w:cs="Courier New" w:eastAsia="Courier New" w:hAnsi="Courier New"/>
-                <w:color w:val="27ae60"/>
-                <w:sz w:val="24"/>
-                <w:szCs w:val="24"/>
-              </w:rPr>
-              <w:t xml:space="preserve">[ ]</w:t>
+            <w:r>
+              <w:t>[x]</w:t>
             </w:r>
           </w:p>
         </w:tc>
@@ -3877,18 +3554,8 @@
             </w:tcMar>
           </w:tcPr>
           <w:p>
-            <w:pPr>
-              <w:jc w:val="left"/>
-            </w:pPr>
-            <w:r>
-              <w:rPr>
-                <w:rFonts w:ascii="Times New Roman" w:cs="Times New Roman" w:eastAsia="Times New Roman" w:hAnsi="Times New Roman"/>
-                <w:b w:val="false"/>
-                <w:bCs w:val="false"/>
-                <w:sz w:val="24"/>
-                <w:szCs w:val="24"/>
-              </w:rPr>
-              <w:t xml:space="preserve">[...]</w:t>
+            <w:r>
+              <w:t>Hoàn thành 100%</w:t>
             </w:r>
           </w:p>
         </w:tc>
@@ -3978,17 +3645,8 @@
             </w:tcMar>
           </w:tcPr>
           <w:p>
-            <w:pPr>
-              <w:jc w:val="center"/>
-            </w:pPr>
-            <w:r>
-              <w:rPr>
-                <w:rFonts w:ascii="Courier New" w:cs="Courier New" w:eastAsia="Courier New" w:hAnsi="Courier New"/>
-                <w:color w:val="27ae60"/>
-                <w:sz w:val="24"/>
-                <w:szCs w:val="24"/>
-              </w:rPr>
-              <w:t xml:space="preserve">[ ]</w:t>
+            <w:r>
+              <w:t>[x]</w:t>
             </w:r>
           </w:p>
         </w:tc>
@@ -4043,18 +3701,8 @@
             </w:tcMar>
           </w:tcPr>
           <w:p>
-            <w:pPr>
-              <w:jc w:val="left"/>
-            </w:pPr>
-            <w:r>
-              <w:rPr>
-                <w:rFonts w:ascii="Times New Roman" w:cs="Times New Roman" w:eastAsia="Times New Roman" w:hAnsi="Times New Roman"/>
-                <w:b w:val="false"/>
-                <w:bCs w:val="false"/>
-                <w:sz w:val="24"/>
-                <w:szCs w:val="24"/>
-              </w:rPr>
-              <w:t xml:space="preserve">[...]</w:t>
+            <w:r>
+              <w:t>Hoàn thành 100%</w:t>
             </w:r>
           </w:p>
         </w:tc>
@@ -4144,17 +3792,8 @@
             </w:tcMar>
           </w:tcPr>
           <w:p>
-            <w:pPr>
-              <w:jc w:val="center"/>
-            </w:pPr>
-            <w:r>
-              <w:rPr>
-                <w:rFonts w:ascii="Courier New" w:cs="Courier New" w:eastAsia="Courier New" w:hAnsi="Courier New"/>
-                <w:color w:val="27ae60"/>
-                <w:sz w:val="24"/>
-                <w:szCs w:val="24"/>
-              </w:rPr>
-              <w:t xml:space="preserve">[ ]</w:t>
+            <w:r>
+              <w:t>[x]</w:t>
             </w:r>
           </w:p>
         </w:tc>
@@ -4209,18 +3848,8 @@
             </w:tcMar>
           </w:tcPr>
           <w:p>
-            <w:pPr>
-              <w:jc w:val="left"/>
-            </w:pPr>
-            <w:r>
-              <w:rPr>
-                <w:rFonts w:ascii="Times New Roman" w:cs="Times New Roman" w:eastAsia="Times New Roman" w:hAnsi="Times New Roman"/>
-                <w:b w:val="false"/>
-                <w:bCs w:val="false"/>
-                <w:sz w:val="24"/>
-                <w:szCs w:val="24"/>
-              </w:rPr>
-              <w:t xml:space="preserve">[...]</w:t>
+            <w:r>
+              <w:t>Hoàn thành 100%</w:t>
             </w:r>
           </w:p>
         </w:tc>
@@ -4310,18 +3939,8 @@
             </w:tcMar>
           </w:tcPr>
           <w:p>
-            <w:pPr>
-              <w:jc w:val="center"/>
-            </w:pPr>
-            <w:r>
-              <w:rPr>
-                <w:rFonts w:ascii="Times New Roman" w:cs="Times New Roman" w:eastAsia="Times New Roman" w:hAnsi="Times New Roman"/>
-                <w:b/>
-                <w:bCs/>
-                <w:sz w:val="24"/>
-                <w:szCs w:val="24"/>
-              </w:rPr>
-              <w:t xml:space="preserve">___/4</w:t>
+            <w:r>
+              <w:t>4/4</w:t>
             </w:r>
           </w:p>
         </w:tc>

</xml_diff>